<commit_message>
Sostituisce il blocco spalla/mobilità del 6° allenamento con la scaletta
Al posto di "Cura spalla e mobilità" (già coperta in prevenzione), il
blocco da 18 minuti diventa lavoro di scaletta: appoggi e cambi di
direzione senza salti, per preparare i piedi alla seduta di ricezione.

Co-Authored-By: Claude Sonnet 5 <noreply@anthropic.com>
Claude-Session: https://claude.ai/code/session_01PVkJmQQ5purAx475wogrcv
</commit_message>
<xml_diff>
--- a/serie-d/settimana-2/Serie D - 6a allenamento - mercoledi 9 settembre.docx
+++ b/serie-d/settimana-2/Serie D - 6a allenamento - mercoledi 9 settembre.docx
@@ -349,61 +349,128 @@
           <w:sz w:val="24"/>
           <w:szCs w:val="24"/>
         </w:rPr>
-        <w:t xml:space="preserve">Cura spalla e mobilità — 18 minuti</w:t>
-      </w:r>
-    </w:p>
-    <w:p>
-      <w:pPr>
-        <w:pStyle w:val="ListParagraph"/>
-        <w:numPr>
-          <w:ilvl w:val="0"/>
-          <w:numId w:val="2"/>
-        </w:numPr>
-        <w:spacing w:after="60"/>
-      </w:pPr>
-      <w:r>
-        <w:rPr>
-          <w:rFonts w:ascii="Calibri" w:cs="Calibri" w:eastAsia="Calibri" w:hAnsi="Calibri"/>
-          <w:sz w:val="22"/>
-          <w:szCs w:val="22"/>
-        </w:rPr>
-        <w:t xml:space="preserve">Cuffia dei rotatori con elastico — 2 × 15</w:t>
-      </w:r>
-    </w:p>
-    <w:p>
-      <w:pPr>
-        <w:pStyle w:val="ListParagraph"/>
-        <w:numPr>
-          <w:ilvl w:val="0"/>
-          <w:numId w:val="2"/>
-        </w:numPr>
-        <w:spacing w:after="60"/>
-      </w:pPr>
-      <w:r>
-        <w:rPr>
-          <w:rFonts w:ascii="Calibri" w:cs="Calibri" w:eastAsia="Calibri" w:hAnsi="Calibri"/>
-          <w:sz w:val="22"/>
-          <w:szCs w:val="22"/>
-        </w:rPr>
-        <w:t xml:space="preserve">Dead bug — 2 × 30″</w:t>
-      </w:r>
-    </w:p>
-    <w:p>
-      <w:pPr>
-        <w:pStyle w:val="ListParagraph"/>
-        <w:numPr>
-          <w:ilvl w:val="0"/>
-          <w:numId w:val="2"/>
-        </w:numPr>
-        <w:spacing w:after="60"/>
-      </w:pPr>
-      <w:r>
-        <w:rPr>
-          <w:rFonts w:ascii="Calibri" w:cs="Calibri" w:eastAsia="Calibri" w:hAnsi="Calibri"/>
-          <w:sz w:val="22"/>
-          <w:szCs w:val="22"/>
-        </w:rPr>
-        <w:t xml:space="preserve">Mobilità di torace e anca</w:t>
+        <w:t xml:space="preserve">Scaletta — 18 minuti</w:t>
+      </w:r>
+    </w:p>
+    <w:p>
+      <w:pPr>
+        <w:spacing w:after="100"/>
+      </w:pPr>
+      <w:r>
+        <w:rPr>
+          <w:rFonts w:ascii="Calibri" w:cs="Calibri" w:eastAsia="Calibri" w:hAnsi="Calibri"/>
+          <w:sz w:val="22"/>
+          <w:szCs w:val="22"/>
+        </w:rPr>
+        <w:t xml:space="preserve">Appoggi e cambi di direzione, senza salti: prepara i piedi per la ricezione di oggi.</w:t>
+      </w:r>
+    </w:p>
+    <w:p>
+      <w:pPr>
+        <w:pStyle w:val="ListParagraph"/>
+        <w:numPr>
+          <w:ilvl w:val="0"/>
+          <w:numId w:val="2"/>
+        </w:numPr>
+        <w:spacing w:after="60"/>
+      </w:pPr>
+      <w:r>
+        <w:rPr>
+          <w:rFonts w:ascii="Calibri" w:cs="Calibri" w:eastAsia="Calibri" w:hAnsi="Calibri"/>
+          <w:sz w:val="22"/>
+          <w:szCs w:val="22"/>
+        </w:rPr>
+        <w:t xml:space="preserve">Passo singolo, un appoggio per casella — 2 ×</w:t>
+      </w:r>
+    </w:p>
+    <w:p>
+      <w:pPr>
+        <w:pStyle w:val="ListParagraph"/>
+        <w:numPr>
+          <w:ilvl w:val="0"/>
+          <w:numId w:val="2"/>
+        </w:numPr>
+        <w:spacing w:after="60"/>
+      </w:pPr>
+      <w:r>
+        <w:rPr>
+          <w:rFonts w:ascii="Calibri" w:cs="Calibri" w:eastAsia="Calibri" w:hAnsi="Calibri"/>
+          <w:sz w:val="22"/>
+          <w:szCs w:val="22"/>
+        </w:rPr>
+        <w:t xml:space="preserve">In-in-out-out — 2 ×</w:t>
+      </w:r>
+    </w:p>
+    <w:p>
+      <w:pPr>
+        <w:pStyle w:val="ListParagraph"/>
+        <w:numPr>
+          <w:ilvl w:val="0"/>
+          <w:numId w:val="2"/>
+        </w:numPr>
+        <w:spacing w:after="60"/>
+      </w:pPr>
+      <w:r>
+        <w:rPr>
+          <w:rFonts w:ascii="Calibri" w:cs="Calibri" w:eastAsia="Calibri" w:hAnsi="Calibri"/>
+          <w:sz w:val="22"/>
+          <w:szCs w:val="22"/>
+        </w:rPr>
+        <w:t xml:space="preserve">Passo laterale, fianco alla scaletta — 2 × per lato</w:t>
+      </w:r>
+    </w:p>
+    <w:p>
+      <w:pPr>
+        <w:pStyle w:val="ListParagraph"/>
+        <w:numPr>
+          <w:ilvl w:val="0"/>
+          <w:numId w:val="2"/>
+        </w:numPr>
+        <w:spacing w:after="60"/>
+      </w:pPr>
+      <w:r>
+        <w:rPr>
+          <w:rFonts w:ascii="Calibri" w:cs="Calibri" w:eastAsia="Calibri" w:hAnsi="Calibri"/>
+          <w:sz w:val="22"/>
+          <w:szCs w:val="22"/>
+        </w:rPr>
+        <w:t xml:space="preserve">Incrocio avanti-dietro — 2 ×</w:t>
+      </w:r>
+    </w:p>
+    <w:p>
+      <w:pPr>
+        <w:pStyle w:val="ListParagraph"/>
+        <w:numPr>
+          <w:ilvl w:val="0"/>
+          <w:numId w:val="2"/>
+        </w:numPr>
+        <w:spacing w:after="60"/>
+      </w:pPr>
+      <w:r>
+        <w:rPr>
+          <w:rFonts w:ascii="Calibri" w:cs="Calibri" w:eastAsia="Calibri" w:hAnsi="Calibri"/>
+          <w:sz w:val="22"/>
+          <w:szCs w:val="22"/>
+        </w:rPr>
+        <w:t xml:space="preserve">Doppio appoggio con arresto e caricamento basso, posizione da ricezione — 2 ×</w:t>
+      </w:r>
+    </w:p>
+    <w:p>
+      <w:pPr>
+        <w:pStyle w:val="ListParagraph"/>
+        <w:numPr>
+          <w:ilvl w:val="0"/>
+          <w:numId w:val="2"/>
+        </w:numPr>
+        <w:spacing w:after="60"/>
+      </w:pPr>
+      <w:r>
+        <w:rPr>
+          <w:rFonts w:ascii="Calibri" w:cs="Calibri" w:eastAsia="Calibri" w:hAnsi="Calibri"/>
+          <w:sz w:val="22"/>
+          <w:szCs w:val="22"/>
+        </w:rPr>
+        <w:t xml:space="preserve">Uscita laterale rapida dopo la scaletta, 3 metri — 2 × per lato</w:t>
       </w:r>
     </w:p>
     <w:p>

</xml_diff>